<commit_message>
upd docs for lab1
</commit_message>
<xml_diff>
--- a/lab1/docs/Лабораторная_работа_1_отчёт.docx
+++ b/lab1/docs/Лабораторная_работа_1_отчёт.docx
@@ -2600,14 +2600,13 @@
           <w:szCs w:val="26"/>
           <w:lang w:val="ru-RU"/>
         </w:rPr>
-        <w:t>Вывод</w:t>
+        <w:t>Результат работы</w:t>
       </w:r>
     </w:p>
     <w:p>
       <w:pPr>
         <w:ind w:firstLine="567"/>
         <w:rPr>
-          <w:sz w:val="24"/>
           <w:szCs w:val="24"/>
           <w:lang w:val="ru-RU"/>
         </w:rPr>
@@ -2763,6 +2762,120 @@
           <w:szCs w:val="24"/>
         </w:rPr>
         <w:t>ColorConverter</w:t>
+      </w:r>
+      <w:r>
+        <w:rPr>
+          <w:sz w:val="24"/>
+          <w:szCs w:val="24"/>
+          <w:lang w:val="ru-RU"/>
+        </w:rPr>
+        <w:t xml:space="preserve">. Приложение позволяет задавать цвет несколькими способами, автоматически пересчитывать значения моделей </w:t>
+      </w:r>
+      <w:r>
+        <w:rPr>
+          <w:sz w:val="24"/>
+          <w:szCs w:val="24"/>
+        </w:rPr>
+        <w:t>RGB</w:t>
+      </w:r>
+      <w:r>
+        <w:rPr>
+          <w:sz w:val="24"/>
+          <w:szCs w:val="24"/>
+          <w:lang w:val="ru-RU"/>
+        </w:rPr>
+        <w:t xml:space="preserve">, </w:t>
+      </w:r>
+      <w:r>
+        <w:rPr>
+          <w:sz w:val="24"/>
+          <w:szCs w:val="24"/>
+        </w:rPr>
+        <w:t>CMYK</w:t>
+      </w:r>
+      <w:r>
+        <w:rPr>
+          <w:sz w:val="24"/>
+          <w:szCs w:val="24"/>
+          <w:lang w:val="ru-RU"/>
+        </w:rPr>
+        <w:t xml:space="preserve"> и </w:t>
+      </w:r>
+      <w:r>
+        <w:rPr>
+          <w:sz w:val="24"/>
+          <w:szCs w:val="24"/>
+        </w:rPr>
+        <w:t>HLS</w:t>
+      </w:r>
+      <w:r>
+        <w:rPr>
+          <w:sz w:val="24"/>
+          <w:szCs w:val="24"/>
+          <w:lang w:val="ru-RU"/>
+        </w:rPr>
+        <w:t xml:space="preserve"> и </w:t>
+      </w:r>
+      <w:r>
+        <w:rPr>
+          <w:sz w:val="24"/>
+          <w:szCs w:val="24"/>
+          <w:lang w:val="ru-RU"/>
+        </w:rPr>
+        <w:t>отображать результат в удобном виде</w:t>
+      </w:r>
+      <w:r>
+        <w:rPr>
+          <w:szCs w:val="24"/>
+          <w:lang w:val="ru-RU"/>
+        </w:rPr>
+        <w:t>.</w:t>
+      </w:r>
+    </w:p>
+    <w:p>
+      <w:pPr>
+        <w:ind w:firstLine="567"/>
+        <w:rPr>
+          <w:b/>
+          <w:sz w:val="26"/>
+          <w:szCs w:val="26"/>
+          <w:lang w:val="ru-RU"/>
+        </w:rPr>
+      </w:pPr>
+      <w:r>
+        <w:rPr>
+          <w:b/>
+          <w:sz w:val="26"/>
+          <w:szCs w:val="26"/>
+          <w:lang w:val="ru-RU"/>
+        </w:rPr>
+        <w:t>Вывод</w:t>
+      </w:r>
+    </w:p>
+    <w:p>
+      <w:pPr>
+        <w:ind w:firstLine="567"/>
+        <w:rPr>
+          <w:sz w:val="24"/>
+          <w:szCs w:val="24"/>
+          <w:lang w:val="ru-RU"/>
+        </w:rPr>
+      </w:pPr>
+      <w:r>
+        <w:rPr>
+          <w:sz w:val="24"/>
+          <w:szCs w:val="24"/>
+          <w:lang w:val="ru-RU"/>
+        </w:rPr>
+        <w:t>Ц</w:t>
+      </w:r>
+      <w:r>
+        <w:rPr>
+          <w:sz w:val="24"/>
+          <w:szCs w:val="24"/>
+          <w:lang w:val="ru-RU"/>
+        </w:rPr>
+        <w:t xml:space="preserve">ветовые модели не взаимозаменяемы (RGB — аддитивная, CMYK — субтрактивная, HLS — перцепционная). Прямой переход без потерь невозможен, связующим звеном выступает аппаратное </w:t>
       </w:r>
       <w:bookmarkStart w:id="0" w:name="_GoBack"/>
       <w:bookmarkEnd w:id="0"/>
@@ -2772,68 +2885,51 @@
           <w:szCs w:val="24"/>
           <w:lang w:val="ru-RU"/>
         </w:rPr>
-        <w:t xml:space="preserve">. Приложение позволяет задавать цвет несколькими способами, автоматически пересчитывать значения моделей </w:t>
-      </w:r>
-      <w:r>
-        <w:rPr>
-          <w:sz w:val="24"/>
-          <w:szCs w:val="24"/>
-        </w:rPr>
-        <w:t>RGB</w:t>
-      </w:r>
-      <w:r>
-        <w:rPr>
-          <w:sz w:val="24"/>
-          <w:szCs w:val="24"/>
-          <w:lang w:val="ru-RU"/>
-        </w:rPr>
-        <w:t xml:space="preserve">, </w:t>
-      </w:r>
-      <w:r>
-        <w:rPr>
-          <w:sz w:val="24"/>
-          <w:szCs w:val="24"/>
-        </w:rPr>
-        <w:t>CMYK</w:t>
-      </w:r>
-      <w:r>
-        <w:rPr>
-          <w:sz w:val="24"/>
-          <w:szCs w:val="24"/>
-          <w:lang w:val="ru-RU"/>
-        </w:rPr>
-        <w:t xml:space="preserve"> и </w:t>
-      </w:r>
-      <w:r>
-        <w:rPr>
-          <w:sz w:val="24"/>
-          <w:szCs w:val="24"/>
-        </w:rPr>
-        <w:t>HLS</w:t>
-      </w:r>
-      <w:r>
-        <w:rPr>
-          <w:sz w:val="24"/>
-          <w:szCs w:val="24"/>
-          <w:lang w:val="ru-RU"/>
-        </w:rPr>
-        <w:t xml:space="preserve"> и </w:t>
-      </w:r>
-      <w:r>
-        <w:rPr>
-          <w:sz w:val="24"/>
-          <w:szCs w:val="24"/>
-          <w:lang w:val="ru-RU"/>
-        </w:rPr>
-        <w:t>отображать результат в удобном виде</w:t>
-      </w:r>
-      <w:r>
-        <w:rPr>
-          <w:szCs w:val="24"/>
-          <w:lang w:val="ru-RU"/>
-        </w:rPr>
-        <w:t>.</w:t>
-      </w:r>
+        <w:t>пространство RGB. Математика цвета нелинейна (гамма-коррекция), а CMYK неоднозначен — одному цвету соответствует множество наборов красок, что исключает покомпонентное сравнение. Ограниченность цветового охвата (график МКО) треб</w:t>
+      </w:r>
+      <w:r>
+        <w:rPr>
+          <w:sz w:val="24"/>
+          <w:szCs w:val="24"/>
+          <w:lang w:val="ru-RU"/>
+        </w:rPr>
+        <w:t>ует контроля выхода за границы.</w:t>
+      </w:r>
+    </w:p>
+    <w:p>
+      <w:pPr>
+        <w:ind w:firstLine="567"/>
+        <w:rPr>
+          <w:lang w:val="ru-RU"/>
+        </w:rPr>
+      </w:pPr>
+      <w:r>
+        <w:rPr>
+          <w:sz w:val="24"/>
+          <w:szCs w:val="24"/>
+          <w:lang w:val="ru-RU"/>
+        </w:rPr>
+        <w:t xml:space="preserve">Синхронизация нескольких моделей — нетривиальная задача. Её решение потребовало введения централизованного ColorController и блокировки Qt-сигналов (blockSignals) для предотвращения рекурсивных вызовов и сбивания ввода. Таким образом, корректный конвертер </w:t>
+      </w:r>
+      <w:r>
+        <w:rPr>
+          <w:sz w:val="24"/>
+          <w:szCs w:val="24"/>
+          <w:lang w:val="ru-RU"/>
+        </w:rPr>
+        <w:lastRenderedPageBreak/>
+        <w:t>цвета — это синтез строгой математики, учёта физиологии восприятия и продуманной архитектуры.</w:t>
+      </w:r>
+    </w:p>
+    <w:p>
+      <w:pPr>
+        <w:ind w:firstLine="567"/>
+        <w:rPr>
+          <w:sz w:val="24"/>
+          <w:szCs w:val="24"/>
+          <w:lang w:val="ru-RU"/>
+        </w:rPr>
+      </w:pPr>
     </w:p>
     <w:p>
       <w:pPr>
@@ -2908,7 +3004,7 @@
         <w:noProof/>
         <w:sz w:val="20"/>
       </w:rPr>
-      <w:t>2</w:t>
+      <w:t>3</w:t>
     </w:r>
     <w:r>
       <w:rPr>
@@ -15953,7 +16049,7 @@
 </file>
 
 <file path=customXml/itemProps1.xml><?xml version="1.0" encoding="utf-8"?>
-<ds:datastoreItem xmlns:ds="http://schemas.openxmlformats.org/officeDocument/2006/customXml" ds:itemID="{B620AA68-76BC-4545-948E-879467473C15}">
+<ds:datastoreItem xmlns:ds="http://schemas.openxmlformats.org/officeDocument/2006/customXml" ds:itemID="{5775C072-8D1F-4482-8AEE-A1210C3AC349}">
   <ds:schemaRefs>
     <ds:schemaRef ds:uri="http://schemas.openxmlformats.org/officeDocument/2006/bibliography"/>
   </ds:schemaRefs>

</xml_diff>

<commit_message>
upd docs for lab1 (final)
</commit_message>
<xml_diff>
--- a/lab1/docs/Лабораторная_работа_1_отчёт.docx
+++ b/lab1/docs/Лабораторная_работа_1_отчёт.docx
@@ -53,14 +53,6 @@
         </w:rPr>
         <w:t xml:space="preserve"> модели</w:t>
       </w:r>
-      <w:r>
-        <w:rPr>
-          <w:b/>
-          <w:sz w:val="32"/>
-          <w:lang w:val="ru-RU"/>
-        </w:rPr>
-        <w:br/>
-      </w:r>
     </w:p>
     <w:p>
       <w:pPr>
@@ -1906,106 +1898,98 @@
           <w:szCs w:val="24"/>
           <w:lang w:val="ru-RU"/>
         </w:rPr>
-        <w:t xml:space="preserve"> сначала находятся максимальная и минимальная нормализованные </w:t>
-      </w:r>
-      <w:r>
-        <w:rPr>
-          <w:sz w:val="24"/>
-          <w:szCs w:val="24"/>
-          <w:lang w:val="ru-RU"/>
+        <w:t xml:space="preserve"> сначала находятся максимальная и минимальная нормализованные компоненты </w:t>
+      </w:r>
+      <w:r>
+        <w:rPr>
+          <w:sz w:val="24"/>
+          <w:szCs w:val="24"/>
+        </w:rPr>
+        <w:t>RGB</w:t>
+      </w:r>
+      <w:r>
+        <w:rPr>
+          <w:sz w:val="24"/>
+          <w:szCs w:val="24"/>
+          <w:lang w:val="ru-RU"/>
+        </w:rPr>
+        <w:t>. Светлота вычисляется по формуле:</w:t>
+      </w:r>
+      <w:r>
+        <w:rPr>
+          <w:sz w:val="24"/>
+          <w:szCs w:val="24"/>
+          <w:lang w:val="ru-RU"/>
+        </w:rPr>
+        <w:t xml:space="preserve"> </w:t>
+      </w:r>
+      <w:r>
+        <w:rPr>
+          <w:sz w:val="24"/>
+          <w:szCs w:val="24"/>
+        </w:rPr>
+        <w:t>L</w:t>
+      </w:r>
+      <w:r>
+        <w:rPr>
+          <w:sz w:val="24"/>
+          <w:szCs w:val="24"/>
+          <w:lang w:val="ru-RU"/>
+        </w:rPr>
+        <w:t xml:space="preserve"> = (</w:t>
+      </w:r>
+      <w:r>
+        <w:rPr>
+          <w:sz w:val="24"/>
+          <w:szCs w:val="24"/>
+        </w:rPr>
+        <w:t>max</w:t>
+      </w:r>
+      <w:r>
+        <w:rPr>
+          <w:sz w:val="24"/>
+          <w:szCs w:val="24"/>
+          <w:lang w:val="ru-RU"/>
+        </w:rPr>
+        <w:t xml:space="preserve"> + </w:t>
+      </w:r>
+      <w:r>
+        <w:rPr>
+          <w:sz w:val="24"/>
+          <w:szCs w:val="24"/>
+        </w:rPr>
+        <w:t>min</w:t>
+      </w:r>
+      <w:r>
+        <w:rPr>
+          <w:sz w:val="24"/>
+          <w:szCs w:val="24"/>
+          <w:lang w:val="ru-RU"/>
+        </w:rPr>
+        <w:t>) / 2.</w:t>
+      </w:r>
+      <w:r>
+        <w:rPr>
+          <w:sz w:val="24"/>
+          <w:szCs w:val="24"/>
+          <w:lang w:val="ru-RU"/>
+        </w:rPr>
+        <w:t xml:space="preserve"> </w:t>
+      </w:r>
+      <w:r>
+        <w:rPr>
+          <w:sz w:val="24"/>
+          <w:szCs w:val="24"/>
+          <w:lang w:val="ru-RU"/>
+        </w:rPr>
+        <w:t xml:space="preserve">При преобразовании </w:t>
+      </w:r>
+      <w:r>
+        <w:rPr>
+          <w:sz w:val="24"/>
+          <w:szCs w:val="24"/>
         </w:rPr>
         <w:lastRenderedPageBreak/>
-        <w:t xml:space="preserve">компоненты </w:t>
-      </w:r>
-      <w:r>
-        <w:rPr>
-          <w:sz w:val="24"/>
-          <w:szCs w:val="24"/>
-        </w:rPr>
-        <w:t>RGB</w:t>
-      </w:r>
-      <w:r>
-        <w:rPr>
-          <w:sz w:val="24"/>
-          <w:szCs w:val="24"/>
-          <w:lang w:val="ru-RU"/>
-        </w:rPr>
-        <w:t>. Светлота вычисляется по формуле:</w:t>
-      </w:r>
-      <w:r>
-        <w:rPr>
-          <w:sz w:val="24"/>
-          <w:szCs w:val="24"/>
-          <w:lang w:val="ru-RU"/>
-        </w:rPr>
-        <w:t xml:space="preserve"> </w:t>
-      </w:r>
-      <w:r>
-        <w:rPr>
-          <w:sz w:val="24"/>
-          <w:szCs w:val="24"/>
-        </w:rPr>
-        <w:t>L</w:t>
-      </w:r>
-      <w:r>
-        <w:rPr>
-          <w:sz w:val="24"/>
-          <w:szCs w:val="24"/>
-          <w:lang w:val="ru-RU"/>
-        </w:rPr>
-        <w:t xml:space="preserve"> = (</w:t>
-      </w:r>
-      <w:r>
-        <w:rPr>
-          <w:sz w:val="24"/>
-          <w:szCs w:val="24"/>
-        </w:rPr>
-        <w:t>max</w:t>
-      </w:r>
-      <w:r>
-        <w:rPr>
-          <w:sz w:val="24"/>
-          <w:szCs w:val="24"/>
-          <w:lang w:val="ru-RU"/>
-        </w:rPr>
-        <w:t xml:space="preserve"> + </w:t>
-      </w:r>
-      <w:r>
-        <w:rPr>
-          <w:sz w:val="24"/>
-          <w:szCs w:val="24"/>
-        </w:rPr>
-        <w:t>min</w:t>
-      </w:r>
-      <w:r>
-        <w:rPr>
-          <w:sz w:val="24"/>
-          <w:szCs w:val="24"/>
-          <w:lang w:val="ru-RU"/>
-        </w:rPr>
-        <w:t>) / 2.</w:t>
-      </w:r>
-      <w:r>
-        <w:rPr>
-          <w:sz w:val="24"/>
-          <w:szCs w:val="24"/>
-          <w:lang w:val="ru-RU"/>
-        </w:rPr>
-        <w:t xml:space="preserve"> </w:t>
-      </w:r>
-      <w:r>
-        <w:rPr>
-          <w:sz w:val="24"/>
-          <w:szCs w:val="24"/>
-          <w:lang w:val="ru-RU"/>
-        </w:rPr>
-        <w:t xml:space="preserve">При преобразовании </w:t>
-      </w:r>
-      <w:r>
-        <w:rPr>
-          <w:sz w:val="24"/>
-          <w:szCs w:val="24"/>
-        </w:rPr>
         <w:t>HLS</w:t>
       </w:r>
       <w:r>
@@ -2875,7 +2859,87 @@
           <w:szCs w:val="24"/>
           <w:lang w:val="ru-RU"/>
         </w:rPr>
-        <w:t xml:space="preserve">ветовые модели не взаимозаменяемы (RGB — аддитивная, CMYK — субтрактивная, HLS — перцепционная). Прямой переход без потерь невозможен, связующим звеном выступает аппаратное </w:t>
+        <w:t xml:space="preserve">ветовые модели не </w:t>
+      </w:r>
+      <w:r>
+        <w:rPr>
+          <w:sz w:val="24"/>
+          <w:szCs w:val="24"/>
+          <w:lang w:val="ru-RU"/>
+        </w:rPr>
+        <w:t xml:space="preserve">являются </w:t>
+      </w:r>
+      <w:r>
+        <w:rPr>
+          <w:sz w:val="24"/>
+          <w:szCs w:val="24"/>
+          <w:lang w:val="ru-RU"/>
+        </w:rPr>
+        <w:t>взаимозаменяемы</w:t>
+      </w:r>
+      <w:r>
+        <w:rPr>
+          <w:sz w:val="24"/>
+          <w:szCs w:val="24"/>
+          <w:lang w:val="ru-RU"/>
+        </w:rPr>
+        <w:t>ми.</w:t>
+      </w:r>
+      <w:r>
+        <w:rPr>
+          <w:sz w:val="24"/>
+          <w:szCs w:val="24"/>
+          <w:lang w:val="ru-RU"/>
+        </w:rPr>
+        <w:t xml:space="preserve"> </w:t>
+      </w:r>
+      <w:r>
+        <w:rPr>
+          <w:sz w:val="24"/>
+          <w:szCs w:val="24"/>
+          <w:lang w:val="ru-RU"/>
+        </w:rPr>
+        <w:t>RGB — аддитивная модель, описывающая излучение экрана, CMYK — субтрактивная, зависящая от красителей и бумаги, а HLS — перцепционная, ориентированная на человеческое восприятие. Прямой переход между ними без потерь невозможен: связующим звеном всегда выступает аппаратно-зависимое пространство RGB, а для физически корректных расчётов — пространства XYZ и Lab.</w:t>
+      </w:r>
+      <w:r>
+        <w:rPr>
+          <w:sz w:val="24"/>
+          <w:szCs w:val="24"/>
+          <w:lang w:val="ru-RU"/>
+        </w:rPr>
+        <w:t xml:space="preserve"> </w:t>
+      </w:r>
+      <w:r>
+        <w:rPr>
+          <w:sz w:val="24"/>
+          <w:szCs w:val="24"/>
+          <w:lang w:val="ru-RU"/>
+        </w:rPr>
+        <w:t>Ограниченность цветового охвата (график МКО) треб</w:t>
+      </w:r>
+      <w:r>
+        <w:rPr>
+          <w:sz w:val="24"/>
+          <w:szCs w:val="24"/>
+          <w:lang w:val="ru-RU"/>
+        </w:rPr>
+        <w:t>ует контроля выхода за границы.</w:t>
+      </w:r>
+    </w:p>
+    <w:p>
+      <w:pPr>
+        <w:ind w:firstLine="567"/>
+        <w:rPr>
+          <w:lang w:val="ru-RU"/>
+        </w:rPr>
+      </w:pPr>
+      <w:r>
+        <w:rPr>
+          <w:sz w:val="24"/>
+          <w:szCs w:val="24"/>
+          <w:lang w:val="ru-RU"/>
+        </w:rPr>
+        <w:t xml:space="preserve">Синхронизация нескольких моделей — нетривиальная задача. Её решение потребовало введения централизованного ColorController и блокировки Qt-сигналов (blockSignals) </w:t>
       </w:r>
       <w:bookmarkStart w:id="0" w:name="_GoBack"/>
       <w:bookmarkEnd w:id="0"/>
@@ -2885,31 +2949,7 @@
           <w:szCs w:val="24"/>
           <w:lang w:val="ru-RU"/>
         </w:rPr>
-        <w:t>пространство RGB. Математика цвета нелинейна (гамма-коррекция), а CMYK неоднозначен — одному цвету соответствует множество наборов красок, что исключает покомпонентное сравнение. Ограниченность цветового охвата (график МКО) треб</w:t>
-      </w:r>
-      <w:r>
-        <w:rPr>
-          <w:sz w:val="24"/>
-          <w:szCs w:val="24"/>
-          <w:lang w:val="ru-RU"/>
-        </w:rPr>
-        <w:t>ует контроля выхода за границы.</w:t>
-      </w:r>
-    </w:p>
-    <w:p>
-      <w:pPr>
-        <w:ind w:firstLine="567"/>
-        <w:rPr>
-          <w:lang w:val="ru-RU"/>
-        </w:rPr>
-      </w:pPr>
-      <w:r>
-        <w:rPr>
-          <w:sz w:val="24"/>
-          <w:szCs w:val="24"/>
-          <w:lang w:val="ru-RU"/>
-        </w:rPr>
-        <w:t xml:space="preserve">Синхронизация нескольких моделей — нетривиальная задача. Её решение потребовало введения централизованного ColorController и блокировки Qt-сигналов (blockSignals) для предотвращения рекурсивных вызовов и сбивания ввода. Таким образом, корректный конвертер </w:t>
+        <w:t xml:space="preserve">для предотвращения рекурсивных вызовов и сбивания ввода. Таким образом, корректный конвертер </w:t>
       </w:r>
       <w:r>
         <w:rPr>
@@ -16049,7 +16089,7 @@
 </file>
 
 <file path=customXml/itemProps1.xml><?xml version="1.0" encoding="utf-8"?>
-<ds:datastoreItem xmlns:ds="http://schemas.openxmlformats.org/officeDocument/2006/customXml" ds:itemID="{5775C072-8D1F-4482-8AEE-A1210C3AC349}">
+<ds:datastoreItem xmlns:ds="http://schemas.openxmlformats.org/officeDocument/2006/customXml" ds:itemID="{51975AAC-8683-472B-9A5E-560F13A89687}">
   <ds:schemaRefs>
     <ds:schemaRef ds:uri="http://schemas.openxmlformats.org/officeDocument/2006/bibliography"/>
   </ds:schemaRefs>

</xml_diff>